<commit_message>
Deployed eb1d0e2 with MkDocs version: 1.6.1
</commit_message>
<xml_diff>
--- a/Buch Camille Chronicles/Rules of Soulmagic.docx
+++ b/Buch Camille Chronicles/Rules of Soulmagic.docx
@@ -95,7 +95,21 @@
         <w:rPr>
           <w:lang w:val="en-US"/>
         </w:rPr>
-        <w:t>Someone, human or Cindered, can have more than 1 Soul at a time. This only occurs when two people die</w:t>
+        <w:t xml:space="preserve">Someone, human or </w:t>
+      </w:r>
+      <w:proofErr w:type="gramStart"/>
+      <w:r>
+        <w:rPr>
+          <w:lang w:val="en-US"/>
+        </w:rPr>
+        <w:t>Cindered</w:t>
+      </w:r>
+      <w:proofErr w:type="gramEnd"/>
+      <w:r>
+        <w:rPr>
+          <w:lang w:val="en-US"/>
+        </w:rPr>
+        <w:t>, can have more than 1 Soul at a time. This only occurs when two people die</w:t>
       </w:r>
       <w:r>
         <w:rPr>
@@ -170,7 +184,21 @@
         <w:rPr>
           <w:lang w:val="en-US"/>
         </w:rPr>
-        <w:t xml:space="preserve"> The notes needed are always 8 in total, the speed of the Melod does not matter. So you can make them follow almost instantly.</w:t>
+        <w:t xml:space="preserve"> The notes needed are always 8 in total, the speed of the Melod does not matter. </w:t>
+      </w:r>
+      <w:proofErr w:type="gramStart"/>
+      <w:r>
+        <w:rPr>
+          <w:lang w:val="en-US"/>
+        </w:rPr>
+        <w:t>So</w:t>
+      </w:r>
+      <w:proofErr w:type="gramEnd"/>
+      <w:r>
+        <w:rPr>
+          <w:lang w:val="en-US"/>
+        </w:rPr>
+        <w:t xml:space="preserve"> you can make them follow almost instantly.</w:t>
       </w:r>
     </w:p>
     <w:p>
@@ -382,6 +410,13 @@
     </w:p>
     <w:p>
       <w:pPr>
+        <w:rPr>
+          <w:lang w:val="en-US"/>
+        </w:rPr>
+      </w:pPr>
+    </w:p>
+    <w:p>
+      <w:pPr>
         <w:pStyle w:val="berschrift2"/>
         <w:rPr>
           <w:lang w:val="en-US"/>
@@ -392,6 +427,366 @@
           <w:lang w:val="en-US"/>
         </w:rPr>
         <w:lastRenderedPageBreak/>
+        <w:t>Academy of Harmonist</w:t>
+      </w:r>
+    </w:p>
+    <w:p>
+      <w:pPr>
+        <w:pStyle w:val="berschrift3"/>
+        <w:rPr>
+          <w:lang w:val="en-US"/>
+        </w:rPr>
+      </w:pPr>
+      <w:r>
+        <w:rPr>
+          <w:lang w:val="en-US"/>
+        </w:rPr>
+        <w:t>Classes</w:t>
+      </w:r>
+    </w:p>
+    <w:p>
+      <w:pPr>
+        <w:pStyle w:val="berschrift4"/>
+        <w:rPr>
+          <w:lang w:val="en-US"/>
+        </w:rPr>
+      </w:pPr>
+      <w:r>
+        <w:rPr>
+          <w:lang w:val="en-US"/>
+        </w:rPr>
+        <w:t xml:space="preserve">General </w:t>
+      </w:r>
+      <w:proofErr w:type="spellStart"/>
+      <w:r>
+        <w:rPr>
+          <w:lang w:val="en-US"/>
+        </w:rPr>
+        <w:t>Soulstice</w:t>
+      </w:r>
+      <w:proofErr w:type="spellEnd"/>
+    </w:p>
+    <w:p>
+      <w:pPr>
+        <w:rPr>
+          <w:lang w:val="en-US"/>
+        </w:rPr>
+      </w:pPr>
+      <w:r>
+        <w:rPr>
+          <w:lang w:val="en-US"/>
+        </w:rPr>
+        <w:t xml:space="preserve">Teaches basics of </w:t>
+      </w:r>
+      <w:proofErr w:type="spellStart"/>
+      <w:r>
+        <w:rPr>
+          <w:lang w:val="en-US"/>
+        </w:rPr>
+        <w:t>Soulstice</w:t>
+      </w:r>
+      <w:proofErr w:type="spellEnd"/>
+      <w:r>
+        <w:rPr>
+          <w:lang w:val="en-US"/>
+        </w:rPr>
+        <w:t xml:space="preserve"> and types of it, as well as regulations around it.</w:t>
+      </w:r>
+    </w:p>
+    <w:p>
+      <w:pPr>
+        <w:pStyle w:val="berschrift4"/>
+        <w:rPr>
+          <w:lang w:val="en-US"/>
+        </w:rPr>
+      </w:pPr>
+      <w:r>
+        <w:rPr>
+          <w:lang w:val="en-US"/>
+        </w:rPr>
+        <w:t>Harmonic History</w:t>
+      </w:r>
+    </w:p>
+    <w:p>
+      <w:pPr>
+        <w:rPr>
+          <w:lang w:val="en-US"/>
+        </w:rPr>
+      </w:pPr>
+      <w:r>
+        <w:rPr>
+          <w:lang w:val="en-US"/>
+        </w:rPr>
+        <w:t xml:space="preserve">Uncovers </w:t>
+      </w:r>
+      <w:proofErr w:type="spellStart"/>
+      <w:r>
+        <w:rPr>
+          <w:lang w:val="en-US"/>
+        </w:rPr>
+        <w:t>Soulstice</w:t>
+      </w:r>
+      <w:proofErr w:type="spellEnd"/>
+      <w:r>
+        <w:rPr>
+          <w:lang w:val="en-US"/>
+        </w:rPr>
+        <w:t xml:space="preserve"> History since the Ceasing and tries to go even earlier beyond that. With no success.</w:t>
+      </w:r>
+    </w:p>
+    <w:p>
+      <w:pPr>
+        <w:pStyle w:val="berschrift4"/>
+        <w:rPr>
+          <w:lang w:val="en-US"/>
+        </w:rPr>
+      </w:pPr>
+      <w:r>
+        <w:rPr>
+          <w:lang w:val="en-US"/>
+        </w:rPr>
+        <w:t>Melodic Art</w:t>
+      </w:r>
+    </w:p>
+    <w:p>
+      <w:pPr>
+        <w:rPr>
+          <w:lang w:val="en-US"/>
+        </w:rPr>
+      </w:pPr>
+      <w:r>
+        <w:rPr>
+          <w:lang w:val="en-US"/>
+        </w:rPr>
+        <w:t>Teaches different methods to produce sounds for Melodies. First classes of this teach to whistle and hum multiple tones at ones, as basics for any Harmonist. Further teachings delve into instruments and devices to use, creating your own in the process. That’s how Camill came up with her Quickness release for her glaive.</w:t>
+      </w:r>
+    </w:p>
+    <w:p>
+      <w:pPr>
+        <w:pStyle w:val="berschrift4"/>
+        <w:rPr>
+          <w:lang w:val="en-US"/>
+        </w:rPr>
+      </w:pPr>
+      <w:r>
+        <w:rPr>
+          <w:lang w:val="en-US"/>
+        </w:rPr>
+        <w:t>New Melodic Research</w:t>
+      </w:r>
+    </w:p>
+    <w:p>
+      <w:pPr>
+        <w:rPr>
+          <w:lang w:val="en-US"/>
+        </w:rPr>
+      </w:pPr>
+      <w:r>
+        <w:rPr>
+          <w:lang w:val="en-US"/>
+        </w:rPr>
+        <w:t xml:space="preserve">Tries to uncover new Melodies, but mathematically there are </w:t>
+      </w:r>
+      <w:r>
+        <w:rPr>
+          <w:lang w:val="en-US"/>
+        </w:rPr>
+        <w:t xml:space="preserve">2,82 </w:t>
+      </w:r>
+      <w:r>
+        <w:rPr>
+          <w:lang w:val="en-US"/>
+        </w:rPr>
+        <w:t>trillion (8 tones x 3 octaves x 12 half tones) combinations with the chromatic system. Finding methods to get reactions from Harmonists with less than 8 tones is paramount. Thousands of years ago new Melodies had been discovered by accident as musicians played. Nowadays that just does not happen anymore.</w:t>
+      </w:r>
+    </w:p>
+    <w:p>
+      <w:pPr>
+        <w:pStyle w:val="berschrift4"/>
+        <w:rPr>
+          <w:lang w:val="en-US"/>
+        </w:rPr>
+      </w:pPr>
+      <w:r>
+        <w:rPr>
+          <w:lang w:val="en-US"/>
+        </w:rPr>
+        <w:t xml:space="preserve">Harmonist </w:t>
+      </w:r>
+      <w:r>
+        <w:rPr>
+          <w:lang w:val="en-US"/>
+        </w:rPr>
+        <w:t>A</w:t>
+      </w:r>
+      <w:r>
+        <w:rPr>
+          <w:lang w:val="en-US"/>
+        </w:rPr>
+        <w:t>thleticism</w:t>
+      </w:r>
+    </w:p>
+    <w:p>
+      <w:pPr>
+        <w:rPr>
+          <w:lang w:val="en-US"/>
+        </w:rPr>
+      </w:pPr>
+      <w:r>
+        <w:rPr>
+          <w:lang w:val="en-US"/>
+        </w:rPr>
+        <w:t>Teaches sports and martial techniques</w:t>
+      </w:r>
+      <w:r>
+        <w:rPr>
+          <w:lang w:val="en-US"/>
+        </w:rPr>
+        <w:t xml:space="preserve"> for body focused </w:t>
+      </w:r>
+      <w:proofErr w:type="spellStart"/>
+      <w:r>
+        <w:rPr>
+          <w:lang w:val="en-US"/>
+        </w:rPr>
+        <w:t>Soulstice</w:t>
+      </w:r>
+      <w:proofErr w:type="spellEnd"/>
+      <w:r>
+        <w:rPr>
+          <w:lang w:val="en-US"/>
+        </w:rPr>
+        <w:t>.</w:t>
+      </w:r>
+    </w:p>
+    <w:p>
+      <w:pPr>
+        <w:pStyle w:val="berschrift4"/>
+        <w:rPr>
+          <w:lang w:val="en-US"/>
+        </w:rPr>
+      </w:pPr>
+      <w:r>
+        <w:rPr>
+          <w:lang w:val="en-US"/>
+        </w:rPr>
+        <w:t xml:space="preserve">Harmonist </w:t>
+      </w:r>
+      <w:r>
+        <w:rPr>
+          <w:lang w:val="en-US"/>
+        </w:rPr>
+        <w:t>Arts and crafts</w:t>
+      </w:r>
+    </w:p>
+    <w:p>
+      <w:pPr>
+        <w:rPr>
+          <w:lang w:val="en-US"/>
+        </w:rPr>
+      </w:pPr>
+      <w:r>
+        <w:rPr>
+          <w:lang w:val="en-US"/>
+        </w:rPr>
+        <w:t xml:space="preserve">Teaches arts and crafts to generating </w:t>
+      </w:r>
+      <w:proofErr w:type="spellStart"/>
+      <w:r>
+        <w:rPr>
+          <w:lang w:val="en-US"/>
+        </w:rPr>
+        <w:t>Soulstice</w:t>
+      </w:r>
+      <w:proofErr w:type="spellEnd"/>
+      <w:r>
+        <w:rPr>
+          <w:lang w:val="en-US"/>
+        </w:rPr>
+        <w:t>.</w:t>
+      </w:r>
+    </w:p>
+    <w:p>
+      <w:pPr>
+        <w:pStyle w:val="berschrift4"/>
+        <w:rPr>
+          <w:lang w:val="en-US"/>
+        </w:rPr>
+      </w:pPr>
+      <w:r>
+        <w:rPr>
+          <w:lang w:val="en-US"/>
+        </w:rPr>
+        <w:t xml:space="preserve">One class for every form of </w:t>
+      </w:r>
+      <w:proofErr w:type="spellStart"/>
+      <w:r>
+        <w:rPr>
+          <w:lang w:val="en-US"/>
+        </w:rPr>
+        <w:t>Soulstice</w:t>
+      </w:r>
+      <w:proofErr w:type="spellEnd"/>
+      <w:r>
+        <w:rPr>
+          <w:lang w:val="en-US"/>
+        </w:rPr>
+        <w:t xml:space="preserve"> except </w:t>
+      </w:r>
+      <w:proofErr w:type="spellStart"/>
+      <w:r>
+        <w:rPr>
+          <w:lang w:val="en-US"/>
+        </w:rPr>
+        <w:t>Shistice</w:t>
+      </w:r>
+      <w:proofErr w:type="spellEnd"/>
+    </w:p>
+    <w:p>
+      <w:pPr>
+        <w:rPr>
+          <w:lang w:val="en-US"/>
+        </w:rPr>
+      </w:pPr>
+      <w:r>
+        <w:rPr>
+          <w:lang w:val="en-US"/>
+        </w:rPr>
+        <w:t xml:space="preserve">Focuses on the abilities of specific </w:t>
+      </w:r>
+      <w:proofErr w:type="spellStart"/>
+      <w:r>
+        <w:rPr>
+          <w:lang w:val="en-US"/>
+        </w:rPr>
+        <w:t>Soulstice</w:t>
+      </w:r>
+      <w:proofErr w:type="spellEnd"/>
+      <w:r>
+        <w:rPr>
+          <w:lang w:val="en-US"/>
+        </w:rPr>
+        <w:t xml:space="preserve"> with their own Professor.</w:t>
+      </w:r>
+    </w:p>
+    <w:p>
+      <w:pPr>
+        <w:rPr>
+          <w:lang w:val="en-US"/>
+        </w:rPr>
+      </w:pPr>
+    </w:p>
+    <w:p>
+      <w:pPr>
+        <w:pStyle w:val="berschrift2"/>
+        <w:rPr>
+          <w:lang w:val="en-US"/>
+        </w:rPr>
+      </w:pPr>
+      <w:r>
+        <w:rPr>
+          <w:lang w:val="en-US"/>
+        </w:rPr>
         <w:t xml:space="preserve">Types of </w:t>
       </w:r>
       <w:proofErr w:type="spellStart"/>
@@ -489,6 +884,12 @@
         </w:rPr>
         <w:t xml:space="preserve"> and wield small forms of it without melody</w:t>
       </w:r>
+      <w:r>
+        <w:rPr>
+          <w:lang w:val="en-US"/>
+        </w:rPr>
+        <w:t>. Can sense the element naturally.</w:t>
+      </w:r>
     </w:p>
     <w:p>
       <w:pPr>
@@ -515,6 +916,7 @@
         <w:rPr>
           <w:lang w:val="en-US"/>
         </w:rPr>
+        <w:lastRenderedPageBreak/>
         <w:t>Kerstice</w:t>
       </w:r>
       <w:proofErr w:type="spellEnd"/>
@@ -609,6 +1011,18 @@
         </w:rPr>
         <w:t xml:space="preserve"> and wield small forms of it without melody</w:t>
       </w:r>
+      <w:r>
+        <w:rPr>
+          <w:lang w:val="en-US"/>
+        </w:rPr>
+        <w:t xml:space="preserve">. </w:t>
+      </w:r>
+      <w:r>
+        <w:rPr>
+          <w:lang w:val="en-US"/>
+        </w:rPr>
+        <w:t>Can sense the element naturally.</w:t>
+      </w:r>
     </w:p>
     <w:p>
       <w:pPr>
@@ -731,6 +1145,18 @@
         </w:rPr>
         <w:t xml:space="preserve"> and wield small forms of it without melody</w:t>
       </w:r>
+      <w:r>
+        <w:rPr>
+          <w:lang w:val="en-US"/>
+        </w:rPr>
+        <w:t xml:space="preserve">. </w:t>
+      </w:r>
+      <w:r>
+        <w:rPr>
+          <w:lang w:val="en-US"/>
+        </w:rPr>
+        <w:t>Can sense the element naturally.</w:t>
+      </w:r>
     </w:p>
     <w:p>
       <w:pPr>
@@ -859,6 +1285,24 @@
         </w:rPr>
         <w:t xml:space="preserve"> and wield small forms of it without melody</w:t>
       </w:r>
+      <w:r>
+        <w:rPr>
+          <w:lang w:val="en-US"/>
+        </w:rPr>
+        <w:t>.</w:t>
+      </w:r>
+      <w:r>
+        <w:rPr>
+          <w:lang w:val="en-US"/>
+        </w:rPr>
+        <w:t xml:space="preserve"> </w:t>
+      </w:r>
+      <w:r>
+        <w:rPr>
+          <w:lang w:val="en-US"/>
+        </w:rPr>
+        <w:t>Can sense the element naturally.</w:t>
+      </w:r>
     </w:p>
     <w:p>
       <w:pPr>
@@ -920,8 +1364,16 @@
         <w:rPr>
           <w:lang w:val="en-US"/>
         </w:rPr>
-        <w:t xml:space="preserve"> | Steel Singers</w:t>
-      </w:r>
+        <w:t xml:space="preserve"> | </w:t>
+      </w:r>
+      <w:bookmarkStart w:id="3" w:name="_Hlk236427736"/>
+      <w:r>
+        <w:rPr>
+          <w:lang w:val="en-US"/>
+        </w:rPr>
+        <w:t>Steel Singers</w:t>
+      </w:r>
+      <w:bookmarkEnd w:id="3"/>
     </w:p>
     <w:p>
       <w:pPr>
@@ -1026,33 +1478,281 @@
         <w:rPr>
           <w:lang w:val="en-US"/>
         </w:rPr>
+        <w:t>Can create and control Steel</w:t>
+      </w:r>
+      <w:r>
+        <w:rPr>
+          <w:lang w:val="en-US"/>
+        </w:rPr>
+        <w:t xml:space="preserve"> (or other metals when those killed the Stice)</w:t>
+      </w:r>
+      <w:r>
+        <w:rPr>
+          <w:lang w:val="en-US"/>
+        </w:rPr>
+        <w:t xml:space="preserve"> in different forms and strengths.</w:t>
+      </w:r>
+    </w:p>
+    <w:p>
+      <w:pPr>
+        <w:rPr>
+          <w:lang w:val="en-US"/>
+        </w:rPr>
+      </w:pPr>
+      <w:r>
+        <w:rPr>
+          <w:lang w:val="en-US"/>
+        </w:rPr>
+        <w:t>Special: Can maintain shapes of steel as armor or weapons</w:t>
+      </w:r>
+      <w:r>
+        <w:rPr>
+          <w:lang w:val="en-US"/>
+        </w:rPr>
+        <w:t xml:space="preserve"> or tools</w:t>
+      </w:r>
+    </w:p>
+    <w:p>
+      <w:pPr>
+        <w:rPr>
+          <w:lang w:val="en-US"/>
+        </w:rPr>
+      </w:pPr>
+      <w:r>
+        <w:rPr>
+          <w:lang w:val="en-US"/>
+        </w:rPr>
+        <w:t>Bond: Can keep up the forming of steel indefinitely without thought</w:t>
+      </w:r>
+      <w:r>
+        <w:rPr>
+          <w:lang w:val="en-US"/>
+        </w:rPr>
+        <w:t xml:space="preserve"> and create unlimited things</w:t>
+      </w:r>
+    </w:p>
+    <w:p>
+      <w:pPr>
+        <w:pStyle w:val="berschrift3"/>
+        <w:rPr>
+          <w:lang w:val="en-US"/>
+        </w:rPr>
+      </w:pPr>
+      <w:bookmarkStart w:id="4" w:name="_Hlk224936954"/>
+      <w:proofErr w:type="spellStart"/>
+      <w:r>
+        <w:rPr>
+          <w:lang w:val="en-US"/>
+        </w:rPr>
+        <w:t>Vaostice</w:t>
+      </w:r>
+      <w:proofErr w:type="spellEnd"/>
+      <w:r>
+        <w:rPr>
+          <w:lang w:val="en-US"/>
+        </w:rPr>
+        <w:t xml:space="preserve"> </w:t>
+      </w:r>
+      <w:bookmarkEnd w:id="4"/>
+      <w:r>
+        <w:rPr>
+          <w:lang w:val="en-US"/>
+        </w:rPr>
+        <w:t>|</w:t>
+      </w:r>
+      <w:r>
+        <w:rPr>
+          <w:lang w:val="en-US"/>
+        </w:rPr>
+        <w:t xml:space="preserve"> </w:t>
+      </w:r>
+      <w:proofErr w:type="spellStart"/>
+      <w:r>
+        <w:rPr>
+          <w:lang w:val="en-US"/>
+        </w:rPr>
+        <w:t>Animalmagic</w:t>
+      </w:r>
+      <w:proofErr w:type="spellEnd"/>
+      <w:r>
+        <w:rPr>
+          <w:lang w:val="en-US"/>
+        </w:rPr>
+        <w:t xml:space="preserve"> | </w:t>
+      </w:r>
+      <w:bookmarkStart w:id="5" w:name="_Hlk224936946"/>
+      <w:r>
+        <w:rPr>
+          <w:lang w:val="en-US"/>
+        </w:rPr>
+        <w:t>Creature Cantors</w:t>
+      </w:r>
+      <w:bookmarkEnd w:id="5"/>
+    </w:p>
+    <w:p>
+      <w:pPr>
+        <w:rPr>
+          <w:lang w:val="en-US"/>
+        </w:rPr>
+      </w:pPr>
+      <w:r>
+        <w:rPr>
+          <w:lang w:val="en-US"/>
+        </w:rPr>
+        <w:t xml:space="preserve">People that died through animal attacks can grant Feral </w:t>
+      </w:r>
+      <w:proofErr w:type="spellStart"/>
+      <w:r>
+        <w:rPr>
+          <w:lang w:val="en-US"/>
+        </w:rPr>
+        <w:t>Soulstice</w:t>
+      </w:r>
+      <w:proofErr w:type="spellEnd"/>
+    </w:p>
+    <w:p>
+      <w:pPr>
+        <w:rPr>
+          <w:lang w:val="en-US"/>
+        </w:rPr>
+      </w:pPr>
+      <w:r>
+        <w:rPr>
+          <w:lang w:val="en-US"/>
+        </w:rPr>
+        <w:t>Can turn into animals and communicate with animals</w:t>
+      </w:r>
+      <w:r>
+        <w:rPr>
+          <w:lang w:val="en-US"/>
+        </w:rPr>
+        <w:t xml:space="preserve"> through their </w:t>
+      </w:r>
+      <w:r>
+        <w:rPr>
+          <w:lang w:val="en-US"/>
+        </w:rPr>
+        <w:t>minds</w:t>
+      </w:r>
+      <w:r>
+        <w:rPr>
+          <w:lang w:val="en-US"/>
+        </w:rPr>
+        <w:t>.</w:t>
+      </w:r>
+    </w:p>
+    <w:p>
+      <w:pPr>
+        <w:rPr>
+          <w:lang w:val="en-US"/>
+        </w:rPr>
+      </w:pPr>
+      <w:r>
+        <w:rPr>
+          <w:lang w:val="en-US"/>
+        </w:rPr>
         <w:lastRenderedPageBreak/>
-        <w:t>Can create and control Steel</w:t>
-      </w:r>
-      <w:r>
-        <w:rPr>
-          <w:lang w:val="en-US"/>
-        </w:rPr>
-        <w:t xml:space="preserve"> (or other metals when those killed the Stice)</w:t>
-      </w:r>
-      <w:r>
-        <w:rPr>
-          <w:lang w:val="en-US"/>
-        </w:rPr>
-        <w:t xml:space="preserve"> in different forms and strengths.</w:t>
-      </w:r>
-    </w:p>
-    <w:p>
-      <w:pPr>
-        <w:rPr>
-          <w:lang w:val="en-US"/>
-        </w:rPr>
-      </w:pPr>
-      <w:r>
-        <w:rPr>
-          <w:lang w:val="en-US"/>
-        </w:rPr>
-        <w:t>Special: Can maintain shapes of steel as armor or weapons with invested calories</w:t>
+        <w:t>Special: Can sense with their senses better and have increased bodily strength</w:t>
+      </w:r>
+    </w:p>
+    <w:p>
+      <w:pPr>
+        <w:rPr>
+          <w:lang w:val="en-US"/>
+        </w:rPr>
+      </w:pPr>
+      <w:r>
+        <w:rPr>
+          <w:lang w:val="en-US"/>
+        </w:rPr>
+        <w:t>Bond: Can heal others and mend their wounds</w:t>
+      </w:r>
+    </w:p>
+    <w:p>
+      <w:pPr>
+        <w:pStyle w:val="berschrift3"/>
+        <w:rPr>
+          <w:lang w:val="en-US"/>
+        </w:rPr>
+      </w:pPr>
+      <w:proofErr w:type="spellStart"/>
+      <w:r>
+        <w:rPr>
+          <w:lang w:val="en-US"/>
+        </w:rPr>
+        <w:t>Nelstice</w:t>
+      </w:r>
+      <w:proofErr w:type="spellEnd"/>
+      <w:r>
+        <w:rPr>
+          <w:lang w:val="en-US"/>
+        </w:rPr>
+        <w:t xml:space="preserve"> </w:t>
+      </w:r>
+      <w:r>
+        <w:rPr>
+          <w:lang w:val="en-US"/>
+        </w:rPr>
+        <w:t xml:space="preserve">| </w:t>
+      </w:r>
+      <w:proofErr w:type="spellStart"/>
+      <w:r>
+        <w:rPr>
+          <w:lang w:val="en-US"/>
+        </w:rPr>
+        <w:t>Plantmagic</w:t>
+      </w:r>
+      <w:proofErr w:type="spellEnd"/>
+      <w:r>
+        <w:rPr>
+          <w:lang w:val="en-US"/>
+        </w:rPr>
+        <w:t xml:space="preserve"> | </w:t>
+      </w:r>
+      <w:r>
+        <w:rPr>
+          <w:lang w:val="en-US"/>
+        </w:rPr>
+        <w:t>Tree Tenor</w:t>
+      </w:r>
+    </w:p>
+    <w:p>
+      <w:pPr>
+        <w:rPr>
+          <w:lang w:val="en-US"/>
+        </w:rPr>
+      </w:pPr>
+      <w:r>
+        <w:rPr>
+          <w:lang w:val="en-US"/>
+        </w:rPr>
+        <w:t>People that died through plants that they had eat, mostly.</w:t>
+      </w:r>
+    </w:p>
+    <w:p>
+      <w:pPr>
+        <w:rPr>
+          <w:lang w:val="en-US"/>
+        </w:rPr>
+      </w:pPr>
+      <w:r>
+        <w:rPr>
+          <w:lang w:val="en-US"/>
+        </w:rPr>
+        <w:t>Can quickly grow a variety of plants from their bodies or touched surfaces with enormous strength and flexibility.</w:t>
+      </w:r>
+    </w:p>
+    <w:p>
+      <w:pPr>
+        <w:rPr>
+          <w:lang w:val="en-US"/>
+        </w:rPr>
+      </w:pPr>
+      <w:r>
+        <w:rPr>
+          <w:lang w:val="en-US"/>
+        </w:rPr>
+        <w:t>Special: Can gain knowledge of happenings from plants</w:t>
       </w:r>
       <w:r>
         <w:rPr>
@@ -1071,7 +1771,7 @@
         <w:rPr>
           <w:lang w:val="en-US"/>
         </w:rPr>
-        <w:t>Bond: Can keep up the forming of steel indefinitely without much thought</w:t>
+        <w:t>Bond: Can let plants grow without Melodies</w:t>
       </w:r>
     </w:p>
     <w:p>
@@ -1081,40 +1781,178 @@
           <w:lang w:val="en-US"/>
         </w:rPr>
       </w:pPr>
-      <w:bookmarkStart w:id="3" w:name="_Hlk224936954"/>
-      <w:proofErr w:type="spellStart"/>
-      <w:r>
-        <w:rPr>
-          <w:lang w:val="en-US"/>
-        </w:rPr>
-        <w:t>Vaostice</w:t>
-      </w:r>
-      <w:proofErr w:type="spellEnd"/>
+      <w:proofErr w:type="spellStart"/>
+      <w:r>
+        <w:rPr>
+          <w:lang w:val="en-US"/>
+        </w:rPr>
+        <w:t>Tshostice</w:t>
+      </w:r>
+      <w:proofErr w:type="spellEnd"/>
+      <w:r>
+        <w:rPr>
+          <w:lang w:val="en-US"/>
+        </w:rPr>
+        <w:t xml:space="preserve"> | </w:t>
+      </w:r>
+      <w:proofErr w:type="spellStart"/>
+      <w:r>
+        <w:rPr>
+          <w:lang w:val="en-US"/>
+        </w:rPr>
+        <w:t>Mindmagic</w:t>
+      </w:r>
+      <w:proofErr w:type="spellEnd"/>
+      <w:r>
+        <w:rPr>
+          <w:lang w:val="en-US"/>
+        </w:rPr>
+        <w:t xml:space="preserve"> | Mind M</w:t>
+      </w:r>
+      <w:r>
+        <w:rPr>
+          <w:lang w:val="en-US"/>
+        </w:rPr>
+        <w:t>instrels</w:t>
+      </w:r>
+    </w:p>
+    <w:p>
+      <w:pPr>
+        <w:rPr>
+          <w:lang w:val="en-US"/>
+        </w:rPr>
+      </w:pPr>
+      <w:r>
+        <w:rPr>
+          <w:lang w:val="en-US"/>
+        </w:rPr>
+        <w:t>People that died of mental disorders or suicide.</w:t>
+      </w:r>
+      <w:r>
+        <w:rPr>
+          <w:lang w:val="en-US"/>
+        </w:rPr>
+        <w:t xml:space="preserve"> Those </w:t>
+      </w:r>
+      <w:proofErr w:type="spellStart"/>
+      <w:r>
+        <w:rPr>
+          <w:lang w:val="en-US"/>
+        </w:rPr>
+        <w:t>Stices</w:t>
+      </w:r>
+      <w:proofErr w:type="spellEnd"/>
+      <w:r>
+        <w:rPr>
+          <w:lang w:val="en-US"/>
+        </w:rPr>
+        <w:t xml:space="preserve"> are the hardest to control as they still retain suicidal memories and </w:t>
+      </w:r>
+      <w:r>
+        <w:rPr>
+          <w:lang w:val="en-US"/>
+        </w:rPr>
+        <w:t>tendencies</w:t>
+      </w:r>
+      <w:r>
+        <w:rPr>
+          <w:lang w:val="en-US"/>
+        </w:rPr>
+        <w:t>.</w:t>
+      </w:r>
+    </w:p>
+    <w:p>
+      <w:pPr>
+        <w:rPr>
+          <w:lang w:val="en-US"/>
+        </w:rPr>
+      </w:pPr>
+      <w:r>
+        <w:rPr>
+          <w:lang w:val="en-US"/>
+        </w:rPr>
+        <w:t>Can control minds of humanoids from simple visions and lies to total mind</w:t>
+      </w:r>
       <w:r>
         <w:rPr>
           <w:lang w:val="en-US"/>
         </w:rPr>
         <w:t xml:space="preserve"> </w:t>
       </w:r>
-      <w:bookmarkEnd w:id="3"/>
-      <w:r>
-        <w:rPr>
-          <w:lang w:val="en-US"/>
-        </w:rPr>
-        <w:t>|</w:t>
-      </w:r>
+      <w:r>
+        <w:rPr>
+          <w:lang w:val="en-US"/>
+        </w:rPr>
+        <w:t>control.</w:t>
+      </w:r>
+    </w:p>
+    <w:p>
+      <w:pPr>
+        <w:rPr>
+          <w:lang w:val="en-US"/>
+        </w:rPr>
+      </w:pPr>
+      <w:r>
+        <w:rPr>
+          <w:lang w:val="en-US"/>
+        </w:rPr>
+        <w:t>Special: Can transmit thoughts into another person’s mind</w:t>
+      </w:r>
+    </w:p>
+    <w:p>
+      <w:pPr>
+        <w:rPr>
+          <w:lang w:val="en-US"/>
+        </w:rPr>
+      </w:pPr>
+      <w:r>
+        <w:rPr>
+          <w:lang w:val="en-US"/>
+        </w:rPr>
+        <w:t>Bond: Can imprint new memories into a person’s mind</w:t>
+      </w:r>
+    </w:p>
+    <w:p>
+      <w:pPr>
+        <w:pStyle w:val="berschrift3"/>
+        <w:rPr>
+          <w:lang w:val="en-US"/>
+        </w:rPr>
+      </w:pPr>
+      <w:bookmarkStart w:id="6" w:name="_Hlk224936964"/>
+      <w:proofErr w:type="spellStart"/>
+      <w:r>
+        <w:rPr>
+          <w:lang w:val="en-US"/>
+        </w:rPr>
+        <w:t>Aikstice</w:t>
+      </w:r>
+      <w:proofErr w:type="spellEnd"/>
       <w:r>
         <w:rPr>
           <w:lang w:val="en-US"/>
         </w:rPr>
         <w:t xml:space="preserve"> </w:t>
       </w:r>
-      <w:proofErr w:type="spellStart"/>
-      <w:r>
-        <w:rPr>
-          <w:lang w:val="en-US"/>
-        </w:rPr>
-        <w:t>Animalmagic</w:t>
+      <w:bookmarkEnd w:id="6"/>
+      <w:r>
+        <w:rPr>
+          <w:lang w:val="en-US"/>
+        </w:rPr>
+        <w:t xml:space="preserve">| </w:t>
+      </w:r>
+      <w:proofErr w:type="spellStart"/>
+      <w:r>
+        <w:rPr>
+          <w:lang w:val="en-US"/>
+        </w:rPr>
+        <w:t>Self</w:t>
+      </w:r>
+      <w:r>
+        <w:rPr>
+          <w:lang w:val="en-US"/>
+        </w:rPr>
+        <w:t>magic</w:t>
       </w:r>
       <w:proofErr w:type="spellEnd"/>
       <w:r>
@@ -1123,26 +1961,30 @@
         </w:rPr>
         <w:t xml:space="preserve"> | </w:t>
       </w:r>
-      <w:bookmarkStart w:id="4" w:name="_Hlk224936946"/>
-      <w:r>
-        <w:rPr>
-          <w:lang w:val="en-US"/>
-        </w:rPr>
-        <w:t>Creature Cantors</w:t>
-      </w:r>
-      <w:bookmarkEnd w:id="4"/>
-    </w:p>
-    <w:p>
-      <w:pPr>
-        <w:rPr>
-          <w:lang w:val="en-US"/>
-        </w:rPr>
-      </w:pPr>
-      <w:r>
-        <w:rPr>
-          <w:lang w:val="en-US"/>
-        </w:rPr>
-        <w:t xml:space="preserve">People that died through animal attacks can grant Feral </w:t>
+      <w:r>
+        <w:rPr>
+          <w:lang w:val="en-US"/>
+        </w:rPr>
+        <w:t>Body Busker</w:t>
+      </w:r>
+      <w:r>
+        <w:rPr>
+          <w:lang w:val="en-US"/>
+        </w:rPr>
+        <w:t>s</w:t>
+      </w:r>
+    </w:p>
+    <w:p>
+      <w:pPr>
+        <w:rPr>
+          <w:lang w:val="en-US"/>
+        </w:rPr>
+      </w:pPr>
+      <w:r>
+        <w:rPr>
+          <w:lang w:val="en-US"/>
+        </w:rPr>
+        <w:t xml:space="preserve">People that died of old age or illnesses of their body, like heart attacks, can grant Self </w:t>
       </w:r>
       <w:proofErr w:type="spellStart"/>
       <w:r>
@@ -1163,33 +2005,58 @@
         <w:rPr>
           <w:lang w:val="en-US"/>
         </w:rPr>
-        <w:t>Can turn into animals and communicate with animals.</w:t>
-      </w:r>
-    </w:p>
-    <w:p>
-      <w:pPr>
-        <w:rPr>
-          <w:lang w:val="en-US"/>
-        </w:rPr>
-      </w:pPr>
-      <w:r>
-        <w:rPr>
-          <w:lang w:val="en-US"/>
-        </w:rPr>
-        <w:t>Special: Can sense with their senses better and have increased bodily strength</w:t>
-      </w:r>
-    </w:p>
-    <w:p>
-      <w:pPr>
-        <w:rPr>
-          <w:lang w:val="en-US"/>
-        </w:rPr>
-      </w:pPr>
-      <w:r>
-        <w:rPr>
-          <w:lang w:val="en-US"/>
-        </w:rPr>
-        <w:t>Bond: Can heal others and mend their wounds</w:t>
+        <w:t>Can control their own body, be it super speed, hearing,</w:t>
+      </w:r>
+      <w:r>
+        <w:rPr>
+          <w:lang w:val="en-US"/>
+        </w:rPr>
+        <w:t xml:space="preserve"> strength, growth.</w:t>
+      </w:r>
+    </w:p>
+    <w:p>
+      <w:pPr>
+        <w:rPr>
+          <w:lang w:val="en-US"/>
+        </w:rPr>
+      </w:pPr>
+      <w:r>
+        <w:rPr>
+          <w:lang w:val="en-US"/>
+        </w:rPr>
+        <w:t>Special: Can sense with their senses better and have increased reflexes</w:t>
+      </w:r>
+    </w:p>
+    <w:p>
+      <w:pPr>
+        <w:rPr>
+          <w:lang w:val="en-US"/>
+        </w:rPr>
+      </w:pPr>
+      <w:r>
+        <w:rPr>
+          <w:lang w:val="en-US"/>
+        </w:rPr>
+        <w:t>Bond: Can heal themselves greatly</w:t>
+      </w:r>
+    </w:p>
+    <w:p>
+      <w:pPr>
+        <w:rPr>
+          <w:lang w:val="en-US"/>
+        </w:rPr>
+      </w:pPr>
+      <w:r>
+        <w:rPr>
+          <w:lang w:val="en-US"/>
+        </w:rPr>
+        <w:t>Ascended: Can regenerate their body</w:t>
+      </w:r>
+      <w:r>
+        <w:rPr>
+          <w:lang w:val="en-US"/>
+        </w:rPr>
+        <w:t xml:space="preserve"> from their Soul.</w:t>
       </w:r>
     </w:p>
     <w:p>
@@ -1204,9 +2071,80 @@
         <w:rPr>
           <w:lang w:val="en-US"/>
         </w:rPr>
-        <w:t>Nelstice</w:t>
-      </w:r>
-      <w:proofErr w:type="spellEnd"/>
+        <w:t>Shistice</w:t>
+      </w:r>
+      <w:proofErr w:type="spellEnd"/>
+      <w:r>
+        <w:rPr>
+          <w:lang w:val="en-US"/>
+        </w:rPr>
+        <w:t xml:space="preserve"> | </w:t>
+      </w:r>
+      <w:proofErr w:type="spellStart"/>
+      <w:r>
+        <w:rPr>
+          <w:lang w:val="en-US"/>
+        </w:rPr>
+        <w:t>Loss</w:t>
+      </w:r>
+      <w:r>
+        <w:rPr>
+          <w:lang w:val="en-US"/>
+        </w:rPr>
+        <w:t>magic</w:t>
+      </w:r>
+      <w:proofErr w:type="spellEnd"/>
+      <w:r>
+        <w:rPr>
+          <w:lang w:val="en-US"/>
+        </w:rPr>
+        <w:t xml:space="preserve"> | Death Dancers</w:t>
+      </w:r>
+    </w:p>
+    <w:p>
+      <w:pPr>
+        <w:rPr>
+          <w:lang w:val="en-US"/>
+        </w:rPr>
+      </w:pPr>
+      <w:r>
+        <w:rPr>
+          <w:lang w:val="en-US"/>
+        </w:rPr>
+        <w:t xml:space="preserve">People that have </w:t>
+      </w:r>
+      <w:r>
+        <w:rPr>
+          <w:lang w:val="en-US"/>
+        </w:rPr>
+        <w:t xml:space="preserve">died through </w:t>
+      </w:r>
+      <w:r>
+        <w:rPr>
+          <w:lang w:val="en-US"/>
+        </w:rPr>
+        <w:t>the dead</w:t>
+      </w:r>
+      <w:r>
+        <w:rPr>
+          <w:lang w:val="en-US"/>
+        </w:rPr>
+        <w:t xml:space="preserve"> can cast Loss </w:t>
+      </w:r>
+      <w:proofErr w:type="spellStart"/>
+      <w:r>
+        <w:rPr>
+          <w:lang w:val="en-US"/>
+        </w:rPr>
+        <w:t>Soulstice</w:t>
+      </w:r>
+      <w:proofErr w:type="spellEnd"/>
+      <w:r>
+        <w:rPr>
+          <w:lang w:val="en-US"/>
+        </w:rPr>
+        <w:t>.</w:t>
+      </w:r>
       <w:r>
         <w:rPr>
           <w:lang w:val="en-US"/>
@@ -1217,6 +2155,233 @@
         <w:rPr>
           <w:lang w:val="en-US"/>
         </w:rPr>
+        <w:t xml:space="preserve">No one knows when it </w:t>
+      </w:r>
+      <w:r>
+        <w:rPr>
+          <w:lang w:val="en-US"/>
+        </w:rPr>
+        <w:t>started</w:t>
+      </w:r>
+      <w:r>
+        <w:rPr>
+          <w:lang w:val="en-US"/>
+        </w:rPr>
+        <w:t>.</w:t>
+      </w:r>
+    </w:p>
+    <w:p>
+      <w:pPr>
+        <w:rPr>
+          <w:lang w:val="en-US"/>
+        </w:rPr>
+      </w:pPr>
+      <w:r>
+        <w:rPr>
+          <w:lang w:val="en-US"/>
+        </w:rPr>
+        <w:t xml:space="preserve">Can control </w:t>
+      </w:r>
+      <w:r>
+        <w:rPr>
+          <w:lang w:val="en-US"/>
+        </w:rPr>
+        <w:t>the dead</w:t>
+      </w:r>
+      <w:r>
+        <w:rPr>
+          <w:lang w:val="en-US"/>
+        </w:rPr>
+        <w:t xml:space="preserve">, rise corpses </w:t>
+      </w:r>
+      <w:r>
+        <w:rPr>
+          <w:lang w:val="en-US"/>
+        </w:rPr>
+        <w:t>o</w:t>
+      </w:r>
+      <w:r>
+        <w:rPr>
+          <w:lang w:val="en-US"/>
+        </w:rPr>
+        <w:t>f humanoids and animals, and can command death itself.</w:t>
+      </w:r>
+    </w:p>
+    <w:p>
+      <w:pPr>
+        <w:rPr>
+          <w:lang w:val="en-US"/>
+        </w:rPr>
+      </w:pPr>
+      <w:r>
+        <w:rPr>
+          <w:lang w:val="en-US"/>
+        </w:rPr>
+        <w:t>Special: Can halt the process of decomposition by touch</w:t>
+      </w:r>
+    </w:p>
+    <w:p>
+      <w:pPr>
+        <w:rPr>
+          <w:lang w:val="en-US"/>
+        </w:rPr>
+      </w:pPr>
+      <w:r>
+        <w:rPr>
+          <w:lang w:val="en-US"/>
+        </w:rPr>
+        <w:t>Bond: Can take memories from the dead</w:t>
+      </w:r>
+    </w:p>
+    <w:p>
+      <w:pPr>
+        <w:rPr>
+          <w:lang w:val="en-US"/>
+        </w:rPr>
+      </w:pPr>
+      <w:r>
+        <w:rPr>
+          <w:lang w:val="en-US"/>
+        </w:rPr>
+        <w:t>Ascended: Can revive dead persons and animals</w:t>
+      </w:r>
+    </w:p>
+    <w:p>
+      <w:pPr>
+        <w:pStyle w:val="berschrift3"/>
+        <w:rPr>
+          <w:lang w:val="en-US"/>
+        </w:rPr>
+      </w:pPr>
+      <w:proofErr w:type="spellStart"/>
+      <w:r>
+        <w:rPr>
+          <w:lang w:val="en-US"/>
+        </w:rPr>
+        <w:lastRenderedPageBreak/>
+        <w:t>Shaikstice</w:t>
+      </w:r>
+      <w:proofErr w:type="spellEnd"/>
+      <w:r>
+        <w:rPr>
+          <w:lang w:val="en-US"/>
+        </w:rPr>
+        <w:t xml:space="preserve"> | </w:t>
+      </w:r>
+      <w:proofErr w:type="spellStart"/>
+      <w:r>
+        <w:rPr>
+          <w:lang w:val="en-US"/>
+        </w:rPr>
+        <w:t>Diseas</w:t>
+      </w:r>
+      <w:r>
+        <w:rPr>
+          <w:lang w:val="en-US"/>
+        </w:rPr>
+        <w:t>e</w:t>
+      </w:r>
+      <w:r>
+        <w:rPr>
+          <w:lang w:val="en-US"/>
+        </w:rPr>
+        <w:t>magic</w:t>
+      </w:r>
+      <w:proofErr w:type="spellEnd"/>
+      <w:r>
+        <w:rPr>
+          <w:lang w:val="en-US"/>
+        </w:rPr>
+        <w:t xml:space="preserve"> | Plague Psalmer</w:t>
+      </w:r>
+    </w:p>
+    <w:p>
+      <w:pPr>
+        <w:rPr>
+          <w:lang w:val="en-US"/>
+        </w:rPr>
+      </w:pPr>
+      <w:r>
+        <w:rPr>
+          <w:lang w:val="en-US"/>
+        </w:rPr>
+        <w:t>People that have died through sickness of virus or bacterial infections.</w:t>
+      </w:r>
+    </w:p>
+    <w:p>
+      <w:pPr>
+        <w:rPr>
+          <w:lang w:val="en-US"/>
+        </w:rPr>
+      </w:pPr>
+      <w:r>
+        <w:rPr>
+          <w:lang w:val="en-US"/>
+        </w:rPr>
+        <w:t xml:space="preserve">Can cast out </w:t>
+      </w:r>
+      <w:r>
+        <w:rPr>
+          <w:lang w:val="en-US"/>
+        </w:rPr>
+        <w:t>infectious clouds, can create liquids that decay the body in minutes.</w:t>
+      </w:r>
+    </w:p>
+    <w:p>
+      <w:pPr>
+        <w:rPr>
+          <w:lang w:val="en-US"/>
+        </w:rPr>
+      </w:pPr>
+      <w:r>
+        <w:rPr>
+          <w:lang w:val="en-US"/>
+        </w:rPr>
+        <w:t>Special: Can cure own diseases and sickness</w:t>
+      </w:r>
+    </w:p>
+    <w:p>
+      <w:pPr>
+        <w:rPr>
+          <w:lang w:val="en-US"/>
+        </w:rPr>
+      </w:pPr>
+      <w:r>
+        <w:rPr>
+          <w:lang w:val="en-US"/>
+        </w:rPr>
+        <w:t>Bond: Can control</w:t>
+      </w:r>
+      <w:r>
+        <w:rPr>
+          <w:lang w:val="en-US"/>
+        </w:rPr>
+        <w:t xml:space="preserve"> existing</w:t>
+      </w:r>
+      <w:r>
+        <w:rPr>
+          <w:lang w:val="en-US"/>
+        </w:rPr>
+        <w:t xml:space="preserve"> sickness in the area by thought without melodies</w:t>
+      </w:r>
+    </w:p>
+    <w:p>
+      <w:pPr>
+        <w:pStyle w:val="berschrift3"/>
+        <w:rPr>
+          <w:lang w:val="en-US"/>
+        </w:rPr>
+      </w:pPr>
+      <w:r>
+        <w:rPr>
+          <w:lang w:val="en-US"/>
+        </w:rPr>
+        <w:t xml:space="preserve">? </w:t>
+      </w:r>
+      <w:r>
+        <w:rPr>
+          <w:lang w:val="en-US"/>
+        </w:rPr>
         <w:t xml:space="preserve">| </w:t>
       </w:r>
       <w:proofErr w:type="spellStart"/>
@@ -1224,698 +2389,23 @@
         <w:rPr>
           <w:lang w:val="en-US"/>
         </w:rPr>
-        <w:t>Plantmagic</w:t>
-      </w:r>
-      <w:proofErr w:type="spellEnd"/>
-      <w:r>
-        <w:rPr>
-          <w:lang w:val="en-US"/>
-        </w:rPr>
-        <w:t xml:space="preserve"> | </w:t>
-      </w:r>
-      <w:r>
-        <w:rPr>
-          <w:lang w:val="en-US"/>
-        </w:rPr>
-        <w:t>Tree Tenor</w:t>
-      </w:r>
-    </w:p>
-    <w:p>
-      <w:pPr>
-        <w:rPr>
-          <w:lang w:val="en-US"/>
-        </w:rPr>
-      </w:pPr>
-      <w:r>
-        <w:rPr>
-          <w:lang w:val="en-US"/>
-        </w:rPr>
-        <w:t>People that died through plants that they had eat, mostly.</w:t>
-      </w:r>
-    </w:p>
-    <w:p>
-      <w:pPr>
-        <w:rPr>
-          <w:lang w:val="en-US"/>
-        </w:rPr>
-      </w:pPr>
-      <w:r>
-        <w:rPr>
-          <w:lang w:val="en-US"/>
-        </w:rPr>
-        <w:t>Can quickly grow a variety of plants from their bodies or touched surfaces with enormous strength and flexibility.</w:t>
-      </w:r>
-    </w:p>
-    <w:p>
-      <w:pPr>
-        <w:rPr>
-          <w:lang w:val="en-US"/>
-        </w:rPr>
-      </w:pPr>
-      <w:r>
-        <w:rPr>
-          <w:lang w:val="en-US"/>
-        </w:rPr>
-        <w:t>Special: Can gain knowledge of happenings from plants</w:t>
-      </w:r>
-      <w:r>
-        <w:rPr>
-          <w:lang w:val="en-US"/>
-        </w:rPr>
-        <w:t xml:space="preserve"> and wield small forms of it without melody</w:t>
-      </w:r>
-    </w:p>
-    <w:p>
-      <w:pPr>
-        <w:rPr>
-          <w:lang w:val="en-US"/>
-        </w:rPr>
-      </w:pPr>
-      <w:r>
-        <w:rPr>
-          <w:lang w:val="en-US"/>
-        </w:rPr>
-        <w:t>Bond: Can let plants grow without Melodies</w:t>
-      </w:r>
-    </w:p>
-    <w:p>
-      <w:pPr>
-        <w:pStyle w:val="berschrift3"/>
-        <w:rPr>
-          <w:lang w:val="en-US"/>
-        </w:rPr>
-      </w:pPr>
-      <w:proofErr w:type="spellStart"/>
-      <w:r>
-        <w:rPr>
-          <w:lang w:val="en-US"/>
-        </w:rPr>
-        <w:t>Tshostice</w:t>
-      </w:r>
-      <w:proofErr w:type="spellEnd"/>
-      <w:r>
-        <w:rPr>
-          <w:lang w:val="en-US"/>
-        </w:rPr>
-        <w:t xml:space="preserve"> | </w:t>
-      </w:r>
-      <w:proofErr w:type="spellStart"/>
-      <w:r>
-        <w:rPr>
-          <w:lang w:val="en-US"/>
-        </w:rPr>
-        <w:t>Mindmagic</w:t>
-      </w:r>
-      <w:proofErr w:type="spellEnd"/>
-      <w:r>
-        <w:rPr>
-          <w:lang w:val="en-US"/>
-        </w:rPr>
-        <w:t xml:space="preserve"> | Mind M</w:t>
-      </w:r>
-      <w:r>
-        <w:rPr>
-          <w:lang w:val="en-US"/>
-        </w:rPr>
-        <w:t>instrels</w:t>
-      </w:r>
-    </w:p>
-    <w:p>
-      <w:pPr>
-        <w:rPr>
-          <w:lang w:val="en-US"/>
-        </w:rPr>
-      </w:pPr>
-      <w:r>
-        <w:rPr>
-          <w:lang w:val="en-US"/>
-        </w:rPr>
-        <w:t>People that died of mental disorders or suicide.</w:t>
-      </w:r>
-      <w:r>
-        <w:rPr>
-          <w:lang w:val="en-US"/>
-        </w:rPr>
-        <w:t xml:space="preserve"> Those </w:t>
-      </w:r>
-      <w:proofErr w:type="spellStart"/>
-      <w:r>
-        <w:rPr>
-          <w:lang w:val="en-US"/>
-        </w:rPr>
-        <w:t>Stices</w:t>
-      </w:r>
-      <w:proofErr w:type="spellEnd"/>
-      <w:r>
-        <w:rPr>
-          <w:lang w:val="en-US"/>
-        </w:rPr>
-        <w:t xml:space="preserve"> are the hardest to control as they still retain suicidal memories and </w:t>
-      </w:r>
-      <w:r>
-        <w:rPr>
-          <w:lang w:val="en-US"/>
-        </w:rPr>
-        <w:t>tendencies</w:t>
-      </w:r>
-      <w:r>
-        <w:rPr>
-          <w:lang w:val="en-US"/>
-        </w:rPr>
-        <w:t>.</w:t>
-      </w:r>
-    </w:p>
-    <w:p>
-      <w:pPr>
-        <w:rPr>
-          <w:lang w:val="en-US"/>
-        </w:rPr>
-      </w:pPr>
-      <w:r>
-        <w:rPr>
-          <w:lang w:val="en-US"/>
-        </w:rPr>
-        <w:t>Can control minds of humanoids from simple visions and lies to total mind</w:t>
-      </w:r>
+        <w:t>Musicmagic</w:t>
+      </w:r>
+      <w:proofErr w:type="spellEnd"/>
       <w:r>
         <w:rPr>
           <w:lang w:val="en-US"/>
         </w:rPr>
         <w:t xml:space="preserve"> </w:t>
       </w:r>
-      <w:r>
-        <w:rPr>
-          <w:lang w:val="en-US"/>
-        </w:rPr>
-        <w:t>control.</w:t>
-      </w:r>
-    </w:p>
-    <w:p>
-      <w:pPr>
-        <w:rPr>
-          <w:lang w:val="en-US"/>
-        </w:rPr>
-      </w:pPr>
-      <w:r>
-        <w:rPr>
-          <w:lang w:val="en-US"/>
-        </w:rPr>
-        <w:t>Special: Can transmit thoughts into another person’s mind</w:t>
-      </w:r>
-    </w:p>
-    <w:p>
-      <w:pPr>
-        <w:rPr>
-          <w:lang w:val="en-US"/>
-        </w:rPr>
-      </w:pPr>
-      <w:r>
-        <w:rPr>
-          <w:lang w:val="en-US"/>
-        </w:rPr>
-        <w:t>Bond: Can imprint new memories into a person’s mind</w:t>
-      </w:r>
-    </w:p>
-    <w:p>
-      <w:pPr>
-        <w:pStyle w:val="berschrift3"/>
-        <w:rPr>
-          <w:lang w:val="en-US"/>
-        </w:rPr>
-      </w:pPr>
-      <w:bookmarkStart w:id="5" w:name="_Hlk224936964"/>
-      <w:proofErr w:type="spellStart"/>
-      <w:r>
-        <w:rPr>
-          <w:lang w:val="en-US"/>
-        </w:rPr>
-        <w:t>Aikstice</w:t>
-      </w:r>
-      <w:proofErr w:type="spellEnd"/>
-      <w:r>
-        <w:rPr>
-          <w:lang w:val="en-US"/>
-        </w:rPr>
-        <w:t xml:space="preserve"> </w:t>
-      </w:r>
-      <w:bookmarkEnd w:id="5"/>
-      <w:r>
-        <w:rPr>
-          <w:lang w:val="en-US"/>
-        </w:rPr>
-        <w:t xml:space="preserve">| </w:t>
-      </w:r>
-      <w:proofErr w:type="spellStart"/>
-      <w:r>
-        <w:rPr>
-          <w:lang w:val="en-US"/>
-        </w:rPr>
-        <w:t>Self</w:t>
-      </w:r>
-      <w:r>
-        <w:rPr>
-          <w:lang w:val="en-US"/>
-        </w:rPr>
-        <w:t>magic</w:t>
-      </w:r>
-      <w:proofErr w:type="spellEnd"/>
-      <w:r>
-        <w:rPr>
-          <w:lang w:val="en-US"/>
-        </w:rPr>
-        <w:t xml:space="preserve"> | </w:t>
-      </w:r>
-      <w:r>
-        <w:rPr>
-          <w:lang w:val="en-US"/>
-        </w:rPr>
-        <w:t>Body Busker</w:t>
-      </w:r>
-      <w:r>
-        <w:rPr>
-          <w:lang w:val="en-US"/>
-        </w:rPr>
-        <w:t>s</w:t>
-      </w:r>
-    </w:p>
-    <w:p>
-      <w:pPr>
-        <w:rPr>
-          <w:lang w:val="en-US"/>
-        </w:rPr>
-      </w:pPr>
-      <w:r>
-        <w:rPr>
-          <w:lang w:val="en-US"/>
-        </w:rPr>
-        <w:t xml:space="preserve">People that died of old age or illnesses of their body, like heart attacks, can grant Self </w:t>
-      </w:r>
-      <w:proofErr w:type="spellStart"/>
-      <w:r>
-        <w:rPr>
-          <w:lang w:val="en-US"/>
-        </w:rPr>
-        <w:t>Soulstice</w:t>
-      </w:r>
-      <w:proofErr w:type="spellEnd"/>
-    </w:p>
-    <w:p>
-      <w:pPr>
-        <w:rPr>
-          <w:lang w:val="en-US"/>
-        </w:rPr>
-      </w:pPr>
-      <w:r>
-        <w:rPr>
-          <w:lang w:val="en-US"/>
-        </w:rPr>
-        <w:t>Can control their own body, be it super speed, hearing,</w:t>
-      </w:r>
-      <w:r>
-        <w:rPr>
-          <w:lang w:val="en-US"/>
-        </w:rPr>
-        <w:t xml:space="preserve"> strength, growth.</w:t>
-      </w:r>
-    </w:p>
-    <w:p>
-      <w:pPr>
-        <w:rPr>
-          <w:lang w:val="en-US"/>
-        </w:rPr>
-      </w:pPr>
-      <w:r>
-        <w:rPr>
-          <w:lang w:val="en-US"/>
-        </w:rPr>
-        <w:t>Special: Can sense with their senses better and have increased reflexes</w:t>
-      </w:r>
-    </w:p>
-    <w:p>
-      <w:pPr>
-        <w:rPr>
-          <w:lang w:val="en-US"/>
-        </w:rPr>
-      </w:pPr>
-      <w:r>
-        <w:rPr>
-          <w:lang w:val="en-US"/>
-        </w:rPr>
-        <w:t>Bond: Can heal themselves greatly</w:t>
-      </w:r>
-    </w:p>
-    <w:p>
-      <w:pPr>
-        <w:rPr>
-          <w:lang w:val="en-US"/>
-        </w:rPr>
-      </w:pPr>
-      <w:r>
-        <w:rPr>
-          <w:lang w:val="en-US"/>
-        </w:rPr>
-        <w:t>Ascended: Can regenerate their body</w:t>
-      </w:r>
-    </w:p>
-    <w:p>
-      <w:pPr>
-        <w:pStyle w:val="berschrift3"/>
-        <w:rPr>
-          <w:lang w:val="en-US"/>
-        </w:rPr>
-      </w:pPr>
-      <w:proofErr w:type="spellStart"/>
-      <w:r>
-        <w:rPr>
-          <w:lang w:val="en-US"/>
-        </w:rPr>
-        <w:lastRenderedPageBreak/>
-        <w:t>Shistice</w:t>
-      </w:r>
-      <w:proofErr w:type="spellEnd"/>
-      <w:r>
-        <w:rPr>
-          <w:lang w:val="en-US"/>
-        </w:rPr>
-        <w:t xml:space="preserve"> | </w:t>
-      </w:r>
-      <w:proofErr w:type="spellStart"/>
-      <w:r>
-        <w:rPr>
-          <w:lang w:val="en-US"/>
-        </w:rPr>
-        <w:t>Loss</w:t>
-      </w:r>
-      <w:r>
-        <w:rPr>
-          <w:lang w:val="en-US"/>
-        </w:rPr>
-        <w:t>magic</w:t>
-      </w:r>
-      <w:proofErr w:type="spellEnd"/>
-      <w:r>
-        <w:rPr>
-          <w:lang w:val="en-US"/>
-        </w:rPr>
-        <w:t xml:space="preserve"> | Death Dancers</w:t>
-      </w:r>
-    </w:p>
-    <w:p>
-      <w:pPr>
-        <w:rPr>
-          <w:lang w:val="en-US"/>
-        </w:rPr>
-      </w:pPr>
-      <w:r>
-        <w:rPr>
-          <w:lang w:val="en-US"/>
-        </w:rPr>
-        <w:t xml:space="preserve">People that have </w:t>
-      </w:r>
-      <w:r>
-        <w:rPr>
-          <w:lang w:val="en-US"/>
-        </w:rPr>
-        <w:t xml:space="preserve">died through </w:t>
-      </w:r>
-      <w:r>
-        <w:rPr>
-          <w:lang w:val="en-US"/>
-        </w:rPr>
-        <w:t>the dead</w:t>
-      </w:r>
-      <w:r>
-        <w:rPr>
-          <w:lang w:val="en-US"/>
-        </w:rPr>
-        <w:t xml:space="preserve"> can cast Loss </w:t>
-      </w:r>
-      <w:proofErr w:type="spellStart"/>
-      <w:r>
-        <w:rPr>
-          <w:lang w:val="en-US"/>
-        </w:rPr>
-        <w:t>Soulstice</w:t>
-      </w:r>
-      <w:proofErr w:type="spellEnd"/>
-      <w:r>
-        <w:rPr>
-          <w:lang w:val="en-US"/>
-        </w:rPr>
-        <w:t>.</w:t>
-      </w:r>
-      <w:r>
-        <w:rPr>
-          <w:lang w:val="en-US"/>
-        </w:rPr>
-        <w:t xml:space="preserve"> </w:t>
-      </w:r>
-      <w:r>
-        <w:rPr>
-          <w:lang w:val="en-US"/>
-        </w:rPr>
-        <w:t xml:space="preserve">No one knows when it </w:t>
-      </w:r>
-      <w:r>
-        <w:rPr>
-          <w:lang w:val="en-US"/>
-        </w:rPr>
-        <w:t>started</w:t>
-      </w:r>
-      <w:r>
-        <w:rPr>
-          <w:lang w:val="en-US"/>
-        </w:rPr>
-        <w:t>.</w:t>
-      </w:r>
-    </w:p>
-    <w:p>
-      <w:pPr>
-        <w:rPr>
-          <w:lang w:val="en-US"/>
-        </w:rPr>
-      </w:pPr>
-      <w:r>
-        <w:rPr>
-          <w:lang w:val="en-US"/>
-        </w:rPr>
-        <w:t xml:space="preserve">Can control </w:t>
-      </w:r>
-      <w:r>
-        <w:rPr>
-          <w:lang w:val="en-US"/>
-        </w:rPr>
-        <w:t>the dead</w:t>
-      </w:r>
-      <w:r>
-        <w:rPr>
-          <w:lang w:val="en-US"/>
-        </w:rPr>
-        <w:t xml:space="preserve">, rise corpses </w:t>
-      </w:r>
-      <w:r>
-        <w:rPr>
-          <w:lang w:val="en-US"/>
-        </w:rPr>
-        <w:t>o</w:t>
-      </w:r>
-      <w:r>
-        <w:rPr>
-          <w:lang w:val="en-US"/>
-        </w:rPr>
-        <w:t>f humanoids and animals, and can command death itself.</w:t>
-      </w:r>
-    </w:p>
-    <w:p>
-      <w:pPr>
-        <w:rPr>
-          <w:lang w:val="en-US"/>
-        </w:rPr>
-      </w:pPr>
-      <w:r>
-        <w:rPr>
-          <w:lang w:val="en-US"/>
-        </w:rPr>
-        <w:t>Special: Can halt the process of decomposition by touch</w:t>
-      </w:r>
-    </w:p>
-    <w:p>
-      <w:pPr>
-        <w:rPr>
-          <w:lang w:val="en-US"/>
-        </w:rPr>
-      </w:pPr>
-      <w:r>
-        <w:rPr>
-          <w:lang w:val="en-US"/>
-        </w:rPr>
-        <w:t>Bond: Can take memories from the dead</w:t>
-      </w:r>
-    </w:p>
-    <w:p>
-      <w:pPr>
-        <w:rPr>
-          <w:lang w:val="en-US"/>
-        </w:rPr>
-      </w:pPr>
-      <w:r>
-        <w:rPr>
-          <w:lang w:val="en-US"/>
-        </w:rPr>
-        <w:t>Ascended: Can revive dead persons and animals</w:t>
-      </w:r>
-    </w:p>
-    <w:p>
-      <w:pPr>
-        <w:pStyle w:val="berschrift3"/>
-        <w:rPr>
-          <w:lang w:val="en-US"/>
-        </w:rPr>
-      </w:pPr>
-      <w:proofErr w:type="spellStart"/>
-      <w:r>
-        <w:rPr>
-          <w:lang w:val="en-US"/>
-        </w:rPr>
-        <w:t>Shaikstice</w:t>
-      </w:r>
-      <w:proofErr w:type="spellEnd"/>
-      <w:r>
-        <w:rPr>
-          <w:lang w:val="en-US"/>
-        </w:rPr>
-        <w:t xml:space="preserve"> | </w:t>
-      </w:r>
-      <w:proofErr w:type="spellStart"/>
-      <w:r>
-        <w:rPr>
-          <w:lang w:val="en-US"/>
-        </w:rPr>
-        <w:t>Diseas</w:t>
-      </w:r>
-      <w:r>
-        <w:rPr>
-          <w:lang w:val="en-US"/>
-        </w:rPr>
-        <w:t>e</w:t>
-      </w:r>
-      <w:r>
-        <w:rPr>
-          <w:lang w:val="en-US"/>
-        </w:rPr>
-        <w:t>magic</w:t>
-      </w:r>
-      <w:proofErr w:type="spellEnd"/>
-      <w:r>
-        <w:rPr>
-          <w:lang w:val="en-US"/>
-        </w:rPr>
-        <w:t xml:space="preserve"> | Plague Psalmer</w:t>
-      </w:r>
-    </w:p>
-    <w:p>
-      <w:pPr>
-        <w:rPr>
-          <w:lang w:val="en-US"/>
-        </w:rPr>
-      </w:pPr>
-      <w:r>
-        <w:rPr>
-          <w:lang w:val="en-US"/>
-        </w:rPr>
-        <w:t>People that have died through sickness of virus or bacterial infections.</w:t>
-      </w:r>
-    </w:p>
-    <w:p>
-      <w:pPr>
-        <w:rPr>
-          <w:lang w:val="en-US"/>
-        </w:rPr>
-      </w:pPr>
-      <w:r>
-        <w:rPr>
-          <w:lang w:val="en-US"/>
-        </w:rPr>
-        <w:t xml:space="preserve">Can cast out </w:t>
-      </w:r>
-      <w:r>
-        <w:rPr>
-          <w:lang w:val="en-US"/>
-        </w:rPr>
-        <w:t>infectious clouds, can create liquids that decay the body in minutes.</w:t>
-      </w:r>
-    </w:p>
-    <w:p>
-      <w:pPr>
-        <w:rPr>
-          <w:lang w:val="en-US"/>
-        </w:rPr>
-      </w:pPr>
-      <w:r>
-        <w:rPr>
-          <w:lang w:val="en-US"/>
-        </w:rPr>
-        <w:t>Special: Can cure own diseases and sickness</w:t>
-      </w:r>
-    </w:p>
-    <w:p>
-      <w:pPr>
-        <w:rPr>
-          <w:lang w:val="en-US"/>
-        </w:rPr>
-      </w:pPr>
-      <w:r>
-        <w:rPr>
-          <w:lang w:val="en-US"/>
-        </w:rPr>
-        <w:t>Bond: Can control</w:t>
-      </w:r>
-      <w:r>
-        <w:rPr>
-          <w:lang w:val="en-US"/>
-        </w:rPr>
-        <w:t xml:space="preserve"> existing</w:t>
-      </w:r>
-      <w:r>
-        <w:rPr>
-          <w:lang w:val="en-US"/>
-        </w:rPr>
-        <w:t xml:space="preserve"> sickness in the area by thought without melodies</w:t>
-      </w:r>
-    </w:p>
-    <w:p>
-      <w:pPr>
-        <w:pStyle w:val="berschrift3"/>
-        <w:rPr>
-          <w:lang w:val="en-US"/>
-        </w:rPr>
-      </w:pPr>
-      <w:r>
-        <w:rPr>
-          <w:lang w:val="en-US"/>
-        </w:rPr>
-        <w:t xml:space="preserve">? </w:t>
-      </w:r>
-      <w:r>
-        <w:rPr>
-          <w:lang w:val="en-US"/>
-        </w:rPr>
-        <w:t xml:space="preserve">| </w:t>
-      </w:r>
-      <w:proofErr w:type="spellStart"/>
-      <w:r>
-        <w:rPr>
-          <w:lang w:val="en-US"/>
-        </w:rPr>
-        <w:t>Musicmagic</w:t>
-      </w:r>
-      <w:proofErr w:type="spellEnd"/>
-      <w:r>
-        <w:rPr>
-          <w:lang w:val="en-US"/>
-        </w:rPr>
-        <w:t xml:space="preserve"> | ?</w:t>
-      </w:r>
+      <w:proofErr w:type="gramStart"/>
+      <w:r>
+        <w:rPr>
+          <w:lang w:val="en-US"/>
+        </w:rPr>
+        <w:t>| ?</w:t>
+      </w:r>
+      <w:proofErr w:type="gramEnd"/>
     </w:p>
     <w:sectPr>
       <w:pgSz w:w="11906" w:h="16838"/>
@@ -2422,7 +2912,6 @@
     <w:next w:val="Standard"/>
     <w:link w:val="berschrift5Zchn"/>
     <w:uiPriority w:val="9"/>
-    <w:semiHidden/>
     <w:unhideWhenUsed/>
     <w:qFormat/>
     <w:rsid w:val="007F4B0F"/>
@@ -2528,7 +3017,6 @@
   <w:style w:type="character" w:default="1" w:styleId="Absatz-Standardschriftart">
     <w:name w:val="Default Paragraph Font"/>
     <w:uiPriority w:val="1"/>
-    <w:semiHidden/>
     <w:unhideWhenUsed/>
   </w:style>
   <w:style w:type="table" w:default="1" w:styleId="NormaleTabelle">
@@ -2609,7 +3097,6 @@
     <w:basedOn w:val="Absatz-Standardschriftart"/>
     <w:link w:val="berschrift5"/>
     <w:uiPriority w:val="9"/>
-    <w:semiHidden/>
     <w:rsid w:val="007F4B0F"/>
     <w:rPr>
       <w:rFonts w:eastAsiaTheme="majorEastAsia" w:cstheme="majorBidi"/>

</xml_diff>